<commit_message>
consultas 1 avance 1
</commit_message>
<xml_diff>
--- a/Consultas1.docx
+++ b/Consultas1.docx
@@ -1,126 +1,513 @@
 
 <file path=word/document.xml><?xml version="1.0" encoding="utf-8"?>
-<w:document xmlns:wpc="http://schemas.microsoft.com/office/word/2010/wordprocessingCanvas" xmlns:cx="http://schemas.microsoft.com/office/drawing/2014/chartex" xmlns:cx1="http://schemas.microsoft.com/office/drawing/2015/9/8/chartex" xmlns:cx2="http://schemas.microsoft.com/office/drawing/2015/10/21/chartex" xmlns:cx3="http://schemas.microsoft.com/office/drawing/2016/5/9/chartex" xmlns:cx4="http://schemas.microsoft.com/office/drawing/2016/5/10/chartex" xmlns:cx5="http://schemas.microsoft.com/office/drawing/2016/5/11/chartex" xmlns:cx6="http://schemas.microsoft.com/office/drawing/2016/5/12/chartex" xmlns:cx7="http://schemas.microsoft.com/office/drawing/2016/5/13/chartex" xmlns:cx8="http://schemas.microsoft.com/office/drawing/2016/5/14/chartex" xmlns:mc="http://schemas.openxmlformats.org/markup-compatibility/2006" xmlns:aink="http://schemas.microsoft.com/office/drawing/2016/ink" xmlns:am3d="http://schemas.microsoft.com/office/drawing/2017/model3d" xmlns:o="urn:schemas-microsoft-com:office:office" xmlns:oel="http://schemas.microsoft.com/office/2019/extlst" xmlns:r="http://schemas.openxmlformats.org/officeDocument/2006/relationships" xmlns:m="http://schemas.openxmlformats.org/officeDocument/2006/math" xmlns:v="urn:schemas-microsoft-com:vml" xmlns:wp14="http://schemas.microsoft.com/office/word/2010/wordprocessingDrawing" xmlns:wp="http://schemas.openxmlformats.org/drawingml/2006/wordprocessingDrawing" xmlns:w10="urn:schemas-microsoft-com:office:word" xmlns:w="http://schemas.openxmlformats.org/wordprocessingml/2006/main" xmlns:w14="http://schemas.microsoft.com/office/word/2010/wordml" xmlns:w15="http://schemas.microsoft.com/office/word/2012/wordml" xmlns:w16cex="http://schemas.microsoft.com/office/word/2018/wordml/cex" xmlns:w16cid="http://schemas.microsoft.com/office/word/2016/wordml/cid" xmlns:w16="http://schemas.microsoft.com/office/word/2018/wordml" xmlns:w16du="http://schemas.microsoft.com/office/word/2023/wordml/word16du" xmlns:w16sdtdh="http://schemas.microsoft.com/office/word/2020/wordml/sdtdatahash" xmlns:w16se="http://schemas.microsoft.com/office/word/2015/wordml/symex" xmlns:wpg="http://schemas.microsoft.com/office/word/2010/wordprocessingGroup" xmlns:wpi="http://schemas.microsoft.com/office/word/2010/wordprocessingInk" xmlns:wne="http://schemas.microsoft.com/office/word/2006/wordml" xmlns:wps="http://schemas.microsoft.com/office/word/2010/wordprocessingShape" mc:Ignorable="w14 w15 w16se w16cid w16 w16cex w16sdtdh w16du wp14">
+<w:document xmlns:wpc="http://schemas.microsoft.com/office/word/2010/wordprocessingCanvas" xmlns:cx="http://schemas.microsoft.com/office/drawing/2014/chartex" xmlns:cx1="http://schemas.microsoft.com/office/drawing/2015/9/8/chartex" xmlns:cx2="http://schemas.microsoft.com/office/drawing/2015/10/21/chartex" xmlns:cx3="http://schemas.microsoft.com/office/drawing/2016/5/9/chartex" xmlns:cx4="http://schemas.microsoft.com/office/drawing/2016/5/10/chartex" xmlns:cx5="http://schemas.microsoft.com/office/drawing/2016/5/11/chartex" xmlns:cx6="http://schemas.microsoft.com/office/drawing/2016/5/12/chartex" xmlns:cx7="http://schemas.microsoft.com/office/drawing/2016/5/13/chartex" xmlns:cx8="http://schemas.microsoft.com/office/drawing/2016/5/14/chartex" xmlns:mc="http://schemas.openxmlformats.org/markup-compatibility/2006" xmlns:aink="http://schemas.microsoft.com/office/drawing/2016/ink" xmlns:am3d="http://schemas.microsoft.com/office/drawing/2017/model3d" xmlns:o="urn:schemas-microsoft-com:office:office" xmlns:oel="http://schemas.microsoft.com/office/2019/extlst" xmlns:r="http://schemas.openxmlformats.org/officeDocument/2006/relationships" xmlns:m="http://schemas.openxmlformats.org/officeDocument/2006/math" xmlns:v="urn:schemas-microsoft-com:vml" xmlns:wp14="http://schemas.microsoft.com/office/word/2010/wordprocessingDrawing" xmlns:wp="http://schemas.openxmlformats.org/drawingml/2006/wordprocessingDrawing" xmlns:w10="urn:schemas-microsoft-com:office:word" xmlns:w="http://schemas.openxmlformats.org/wordprocessingml/2006/main" xmlns:w14="http://schemas.microsoft.com/office/word/2010/wordml" xmlns:w15="http://schemas.microsoft.com/office/word/2012/wordml" xmlns:w16cex="http://schemas.microsoft.com/office/word/2018/wordml/cex" xmlns:w16cid="http://schemas.microsoft.com/office/word/2016/wordml/cid" xmlns:w16="http://schemas.microsoft.com/office/word/2018/wordml" xmlns:w16sdtdh="http://schemas.microsoft.com/office/word/2020/wordml/sdtdatahash" xmlns:w16se="http://schemas.microsoft.com/office/word/2015/wordml/symex" xmlns:wpg="http://schemas.microsoft.com/office/word/2010/wordprocessingGroup" xmlns:wpi="http://schemas.microsoft.com/office/word/2010/wordprocessingInk" xmlns:wne="http://schemas.microsoft.com/office/word/2006/wordml" xmlns:wps="http://schemas.microsoft.com/office/word/2010/wordprocessingShape" mc:Ignorable="w14 w15 w16se w16cid w16 w16cex w16sdtdh wp14">
   <w:body>
     <w:p>
       <w:pPr>
         <w:pStyle w:val="font-claude-response-body"/>
-      </w:pPr>
-      <w:r>
-        <w:rPr>
-          <w:rStyle w:val="Textoennegrita"/>
-          <w:rFonts w:eastAsiaTheme="majorEastAsia"/>
-        </w:rPr>
-        <w:t>1.</w:t>
-      </w:r>
-      <w:r>
-        <w:t xml:space="preserve"> Lista de todos los platillos disponibles con su categoría y precio</w:t>
-      </w:r>
-    </w:p>
-    <w:p>
-      <w:pPr>
-        <w:pStyle w:val="font-claude-response-body"/>
-      </w:pPr>
-      <w:r>
-        <w:rPr>
-          <w:rStyle w:val="Textoennegrita"/>
-          <w:rFonts w:eastAsiaTheme="majorEastAsia"/>
-        </w:rPr>
-        <w:t>2.</w:t>
-      </w:r>
-      <w:r>
-        <w:t xml:space="preserve"> Empleados activos del turno vespertino</w:t>
-      </w:r>
-    </w:p>
-    <w:p>
-      <w:pPr>
-        <w:pStyle w:val="font-claude-response-body"/>
-      </w:pPr>
-      <w:r>
-        <w:rPr>
-          <w:rStyle w:val="Textoennegrita"/>
-          <w:rFonts w:eastAsiaTheme="majorEastAsia"/>
-        </w:rPr>
-        <w:t>3.</w:t>
-      </w:r>
-      <w:r>
-        <w:t xml:space="preserve"> Ingredientes con stock por debajo del mínimo</w:t>
-      </w:r>
-    </w:p>
-    <w:p>
-      <w:pPr>
-        <w:pStyle w:val="font-claude-response-body"/>
-      </w:pPr>
-      <w:r>
-        <w:rPr>
-          <w:rStyle w:val="Textoennegrita"/>
-          <w:rFonts w:eastAsiaTheme="majorEastAsia"/>
-        </w:rPr>
-        <w:t>4.</w:t>
-      </w:r>
-      <w:r>
-        <w:t xml:space="preserve"> Total de órdenes y monto recaudado por método de pago</w:t>
-      </w:r>
-    </w:p>
-    <w:p>
-      <w:pPr>
-        <w:pStyle w:val="font-claude-response-body"/>
-      </w:pPr>
-      <w:r>
-        <w:rPr>
-          <w:rStyle w:val="Textoennegrita"/>
-          <w:rFonts w:eastAsiaTheme="majorEastAsia"/>
-        </w:rPr>
-        <w:t>5.</w:t>
-      </w:r>
-      <w:r>
-        <w:t xml:space="preserve"> Mesas disponibles por ubicación y capacidad</w:t>
-      </w:r>
-    </w:p>
-    <w:p>
-      <w:pPr>
-        <w:pStyle w:val="font-claude-response-body"/>
-      </w:pPr>
-      <w:r>
-        <w:rPr>
-          <w:rStyle w:val="Textoennegrita"/>
-          <w:rFonts w:eastAsiaTheme="majorEastAsia"/>
-        </w:rPr>
-        <w:t>6.</w:t>
-      </w:r>
-      <w:r>
-        <w:t xml:space="preserve"> Órdenes del día de hoy con su estado y mesa asignada</w:t>
-      </w:r>
-    </w:p>
-    <w:p>
-      <w:pPr>
-        <w:pStyle w:val="font-claude-response-body"/>
-      </w:pPr>
-      <w:r>
-        <w:rPr>
-          <w:rStyle w:val="Textoennegrita"/>
-          <w:rFonts w:eastAsiaTheme="majorEastAsia"/>
-        </w:rPr>
-        <w:t>7.</w:t>
-      </w:r>
-      <w:r>
-        <w:t xml:space="preserve"> Proveedores con la cantidad de ingredientes que suministran</w:t>
-      </w:r>
-    </w:p>
-    <w:p>
-      <w:pPr>
-        <w:pStyle w:val="font-claude-response-body"/>
-      </w:pPr>
-      <w:r>
-        <w:rPr>
-          <w:rStyle w:val="Textoennegrita"/>
-          <w:rFonts w:eastAsiaTheme="majorEastAsia"/>
-        </w:rPr>
-        <w:t>8.</w:t>
-      </w:r>
-      <w:r>
-        <w:t xml:space="preserve"> Los 10 platillos más vendidos</w:t>
-      </w:r>
+        <w:numPr>
+          <w:ilvl w:val="0"/>
+          <w:numId w:val="1"/>
+        </w:numPr>
+      </w:pPr>
+      <w:r>
+        <w:t>Lista de todos los platillos disponibles con su categoría y precio</w:t>
+      </w:r>
+    </w:p>
+    <w:p>
+      <w:pPr>
+        <w:pStyle w:val="font-claude-response-body"/>
+        <w:ind w:left="720"/>
+      </w:pPr>
+      <w:r>
+        <w:drawing>
+          <wp:inline distT="0" distB="0" distL="0" distR="0" wp14:anchorId="5924937B" wp14:editId="0EC7B6A4">
+            <wp:extent cx="5612130" cy="3463925"/>
+            <wp:effectExtent l="0" t="0" r="7620" b="3175"/>
+            <wp:docPr id="1" name="Imagen 1"/>
+            <wp:cNvGraphicFramePr>
+              <a:graphicFrameLocks xmlns:a="http://schemas.openxmlformats.org/drawingml/2006/main" noChangeAspect="1"/>
+            </wp:cNvGraphicFramePr>
+            <a:graphic xmlns:a="http://schemas.openxmlformats.org/drawingml/2006/main">
+              <a:graphicData uri="http://schemas.openxmlformats.org/drawingml/2006/picture">
+                <pic:pic xmlns:pic="http://schemas.openxmlformats.org/drawingml/2006/picture">
+                  <pic:nvPicPr>
+                    <pic:cNvPr id="1" name=""/>
+                    <pic:cNvPicPr/>
+                  </pic:nvPicPr>
+                  <pic:blipFill>
+                    <a:blip r:embed="rId5"/>
+                    <a:stretch>
+                      <a:fillRect/>
+                    </a:stretch>
+                  </pic:blipFill>
+                  <pic:spPr>
+                    <a:xfrm>
+                      <a:off x="0" y="0"/>
+                      <a:ext cx="5612130" cy="3463925"/>
+                    </a:xfrm>
+                    <a:prstGeom prst="rect">
+                      <a:avLst/>
+                    </a:prstGeom>
+                  </pic:spPr>
+                </pic:pic>
+              </a:graphicData>
+            </a:graphic>
+          </wp:inline>
+        </w:drawing>
+      </w:r>
+    </w:p>
+    <w:p>
+      <w:pPr>
+        <w:pStyle w:val="font-claude-response-body"/>
+        <w:numPr>
+          <w:ilvl w:val="0"/>
+          <w:numId w:val="1"/>
+        </w:numPr>
+      </w:pPr>
+      <w:r>
+        <w:t>Empleados activos del turno vespertino</w:t>
+      </w:r>
+    </w:p>
+    <w:p>
+      <w:pPr>
+        <w:pStyle w:val="font-claude-response-body"/>
+        <w:ind w:left="720"/>
+      </w:pPr>
+      <w:r>
+        <w:drawing>
+          <wp:inline distT="0" distB="0" distL="0" distR="0" wp14:anchorId="4AEC2795" wp14:editId="357B0CCC">
+            <wp:extent cx="5612130" cy="3125470"/>
+            <wp:effectExtent l="0" t="0" r="7620" b="0"/>
+            <wp:docPr id="2" name="Imagen 2"/>
+            <wp:cNvGraphicFramePr>
+              <a:graphicFrameLocks xmlns:a="http://schemas.openxmlformats.org/drawingml/2006/main" noChangeAspect="1"/>
+            </wp:cNvGraphicFramePr>
+            <a:graphic xmlns:a="http://schemas.openxmlformats.org/drawingml/2006/main">
+              <a:graphicData uri="http://schemas.openxmlformats.org/drawingml/2006/picture">
+                <pic:pic xmlns:pic="http://schemas.openxmlformats.org/drawingml/2006/picture">
+                  <pic:nvPicPr>
+                    <pic:cNvPr id="1" name=""/>
+                    <pic:cNvPicPr/>
+                  </pic:nvPicPr>
+                  <pic:blipFill>
+                    <a:blip r:embed="rId6"/>
+                    <a:stretch>
+                      <a:fillRect/>
+                    </a:stretch>
+                  </pic:blipFill>
+                  <pic:spPr>
+                    <a:xfrm>
+                      <a:off x="0" y="0"/>
+                      <a:ext cx="5612130" cy="3125470"/>
+                    </a:xfrm>
+                    <a:prstGeom prst="rect">
+                      <a:avLst/>
+                    </a:prstGeom>
+                  </pic:spPr>
+                </pic:pic>
+              </a:graphicData>
+            </a:graphic>
+          </wp:inline>
+        </w:drawing>
+      </w:r>
+    </w:p>
+    <w:p>
+      <w:pPr>
+        <w:pStyle w:val="font-claude-response-body"/>
+        <w:ind w:left="720"/>
+      </w:pPr>
+    </w:p>
+    <w:p>
+      <w:pPr>
+        <w:pStyle w:val="font-claude-response-body"/>
+        <w:ind w:left="720"/>
+      </w:pPr>
+    </w:p>
+    <w:p>
+      <w:pPr>
+        <w:pStyle w:val="font-claude-response-body"/>
+        <w:numPr>
+          <w:ilvl w:val="0"/>
+          <w:numId w:val="1"/>
+        </w:numPr>
+      </w:pPr>
+      <w:r>
+        <w:lastRenderedPageBreak/>
+        <w:t>Ingredientes con stock por debajo del mínimo</w:t>
+      </w:r>
+    </w:p>
+    <w:p>
+      <w:pPr>
+        <w:pStyle w:val="font-claude-response-body"/>
+        <w:ind w:left="720"/>
+      </w:pPr>
+      <w:r>
+        <w:drawing>
+          <wp:inline distT="0" distB="0" distL="0" distR="0" wp14:anchorId="4D600E94" wp14:editId="791C1775">
+            <wp:extent cx="5125165" cy="1524213"/>
+            <wp:effectExtent l="0" t="0" r="0" b="0"/>
+            <wp:docPr id="3" name="Imagen 3"/>
+            <wp:cNvGraphicFramePr>
+              <a:graphicFrameLocks xmlns:a="http://schemas.openxmlformats.org/drawingml/2006/main" noChangeAspect="1"/>
+            </wp:cNvGraphicFramePr>
+            <a:graphic xmlns:a="http://schemas.openxmlformats.org/drawingml/2006/main">
+              <a:graphicData uri="http://schemas.openxmlformats.org/drawingml/2006/picture">
+                <pic:pic xmlns:pic="http://schemas.openxmlformats.org/drawingml/2006/picture">
+                  <pic:nvPicPr>
+                    <pic:cNvPr id="1" name=""/>
+                    <pic:cNvPicPr/>
+                  </pic:nvPicPr>
+                  <pic:blipFill>
+                    <a:blip r:embed="rId7"/>
+                    <a:stretch>
+                      <a:fillRect/>
+                    </a:stretch>
+                  </pic:blipFill>
+                  <pic:spPr>
+                    <a:xfrm>
+                      <a:off x="0" y="0"/>
+                      <a:ext cx="5125165" cy="1524213"/>
+                    </a:xfrm>
+                    <a:prstGeom prst="rect">
+                      <a:avLst/>
+                    </a:prstGeom>
+                  </pic:spPr>
+                </pic:pic>
+              </a:graphicData>
+            </a:graphic>
+          </wp:inline>
+        </w:drawing>
+      </w:r>
+    </w:p>
+    <w:p>
+      <w:pPr>
+        <w:pStyle w:val="font-claude-response-body"/>
+        <w:numPr>
+          <w:ilvl w:val="0"/>
+          <w:numId w:val="1"/>
+        </w:numPr>
+      </w:pPr>
+      <w:proofErr w:type="gramStart"/>
+      <w:r>
+        <w:t>Total</w:t>
+      </w:r>
+      <w:proofErr w:type="gramEnd"/>
+      <w:r>
+        <w:t xml:space="preserve"> de órdenes y monto recaudado por método de pago</w:t>
+      </w:r>
+    </w:p>
+    <w:p>
+      <w:pPr>
+        <w:pStyle w:val="font-claude-response-body"/>
+        <w:ind w:left="720"/>
+      </w:pPr>
+      <w:r>
+        <w:drawing>
+          <wp:inline distT="0" distB="0" distL="0" distR="0" wp14:anchorId="6B3C9110" wp14:editId="26353CDE">
+            <wp:extent cx="5612130" cy="2571115"/>
+            <wp:effectExtent l="0" t="0" r="7620" b="635"/>
+            <wp:docPr id="4" name="Imagen 4"/>
+            <wp:cNvGraphicFramePr>
+              <a:graphicFrameLocks xmlns:a="http://schemas.openxmlformats.org/drawingml/2006/main" noChangeAspect="1"/>
+            </wp:cNvGraphicFramePr>
+            <a:graphic xmlns:a="http://schemas.openxmlformats.org/drawingml/2006/main">
+              <a:graphicData uri="http://schemas.openxmlformats.org/drawingml/2006/picture">
+                <pic:pic xmlns:pic="http://schemas.openxmlformats.org/drawingml/2006/picture">
+                  <pic:nvPicPr>
+                    <pic:cNvPr id="1" name=""/>
+                    <pic:cNvPicPr/>
+                  </pic:nvPicPr>
+                  <pic:blipFill>
+                    <a:blip r:embed="rId8"/>
+                    <a:stretch>
+                      <a:fillRect/>
+                    </a:stretch>
+                  </pic:blipFill>
+                  <pic:spPr>
+                    <a:xfrm>
+                      <a:off x="0" y="0"/>
+                      <a:ext cx="5612130" cy="2571115"/>
+                    </a:xfrm>
+                    <a:prstGeom prst="rect">
+                      <a:avLst/>
+                    </a:prstGeom>
+                  </pic:spPr>
+                </pic:pic>
+              </a:graphicData>
+            </a:graphic>
+          </wp:inline>
+        </w:drawing>
+      </w:r>
+    </w:p>
+    <w:p>
+      <w:pPr>
+        <w:pStyle w:val="font-claude-response-body"/>
+        <w:ind w:left="720"/>
+      </w:pPr>
+    </w:p>
+    <w:p>
+      <w:pPr>
+        <w:pStyle w:val="font-claude-response-body"/>
+        <w:ind w:left="720"/>
+      </w:pPr>
+    </w:p>
+    <w:p>
+      <w:pPr>
+        <w:pStyle w:val="font-claude-response-body"/>
+        <w:ind w:left="720"/>
+      </w:pPr>
+    </w:p>
+    <w:p>
+      <w:pPr>
+        <w:pStyle w:val="font-claude-response-body"/>
+        <w:ind w:left="720"/>
+      </w:pPr>
+    </w:p>
+    <w:p>
+      <w:pPr>
+        <w:pStyle w:val="font-claude-response-body"/>
+        <w:ind w:left="720"/>
+      </w:pPr>
+    </w:p>
+    <w:p>
+      <w:pPr>
+        <w:pStyle w:val="font-claude-response-body"/>
+        <w:ind w:left="720"/>
+      </w:pPr>
+    </w:p>
+    <w:p>
+      <w:pPr>
+        <w:pStyle w:val="font-claude-response-body"/>
+        <w:ind w:left="720"/>
+      </w:pPr>
+    </w:p>
+    <w:p>
+      <w:pPr>
+        <w:pStyle w:val="font-claude-response-body"/>
+        <w:ind w:left="720"/>
+      </w:pPr>
+    </w:p>
+    <w:p>
+      <w:pPr>
+        <w:pStyle w:val="font-claude-response-body"/>
+        <w:ind w:left="720"/>
+      </w:pPr>
+    </w:p>
+    <w:p>
+      <w:pPr>
+        <w:pStyle w:val="font-claude-response-body"/>
+        <w:numPr>
+          <w:ilvl w:val="0"/>
+          <w:numId w:val="1"/>
+        </w:numPr>
+      </w:pPr>
+      <w:r>
+        <w:lastRenderedPageBreak/>
+        <w:t>Mesas disponibles por ubicación y capacidad</w:t>
+      </w:r>
+    </w:p>
+    <w:p>
+      <w:pPr>
+        <w:pStyle w:val="font-claude-response-body"/>
+        <w:ind w:left="720"/>
+      </w:pPr>
+      <w:r>
+        <w:drawing>
+          <wp:inline distT="0" distB="0" distL="0" distR="0" wp14:anchorId="315BEA2C" wp14:editId="3268EE27">
+            <wp:extent cx="5612130" cy="4102735"/>
+            <wp:effectExtent l="0" t="0" r="7620" b="0"/>
+            <wp:docPr id="5" name="Imagen 5"/>
+            <wp:cNvGraphicFramePr>
+              <a:graphicFrameLocks xmlns:a="http://schemas.openxmlformats.org/drawingml/2006/main" noChangeAspect="1"/>
+            </wp:cNvGraphicFramePr>
+            <a:graphic xmlns:a="http://schemas.openxmlformats.org/drawingml/2006/main">
+              <a:graphicData uri="http://schemas.openxmlformats.org/drawingml/2006/picture">
+                <pic:pic xmlns:pic="http://schemas.openxmlformats.org/drawingml/2006/picture">
+                  <pic:nvPicPr>
+                    <pic:cNvPr id="1" name=""/>
+                    <pic:cNvPicPr/>
+                  </pic:nvPicPr>
+                  <pic:blipFill>
+                    <a:blip r:embed="rId9"/>
+                    <a:stretch>
+                      <a:fillRect/>
+                    </a:stretch>
+                  </pic:blipFill>
+                  <pic:spPr>
+                    <a:xfrm>
+                      <a:off x="0" y="0"/>
+                      <a:ext cx="5612130" cy="4102735"/>
+                    </a:xfrm>
+                    <a:prstGeom prst="rect">
+                      <a:avLst/>
+                    </a:prstGeom>
+                  </pic:spPr>
+                </pic:pic>
+              </a:graphicData>
+            </a:graphic>
+          </wp:inline>
+        </w:drawing>
+      </w:r>
+    </w:p>
+    <w:p>
+      <w:pPr>
+        <w:pStyle w:val="font-claude-response-body"/>
+        <w:numPr>
+          <w:ilvl w:val="0"/>
+          <w:numId w:val="1"/>
+        </w:numPr>
+      </w:pPr>
+      <w:r>
+        <w:t>Órdenes del día de hoy con su estado y mesa asignada</w:t>
+      </w:r>
+    </w:p>
+    <w:p>
+      <w:pPr>
+        <w:pStyle w:val="font-claude-response-body"/>
+        <w:ind w:left="720"/>
+      </w:pPr>
+      <w:r>
+        <w:drawing>
+          <wp:inline distT="0" distB="0" distL="0" distR="0" wp14:anchorId="0364B9B7" wp14:editId="4A35600C">
+            <wp:extent cx="5363323" cy="1409897"/>
+            <wp:effectExtent l="0" t="0" r="0" b="0"/>
+            <wp:docPr id="6" name="Imagen 6"/>
+            <wp:cNvGraphicFramePr>
+              <a:graphicFrameLocks xmlns:a="http://schemas.openxmlformats.org/drawingml/2006/main" noChangeAspect="1"/>
+            </wp:cNvGraphicFramePr>
+            <a:graphic xmlns:a="http://schemas.openxmlformats.org/drawingml/2006/main">
+              <a:graphicData uri="http://schemas.openxmlformats.org/drawingml/2006/picture">
+                <pic:pic xmlns:pic="http://schemas.openxmlformats.org/drawingml/2006/picture">
+                  <pic:nvPicPr>
+                    <pic:cNvPr id="1" name=""/>
+                    <pic:cNvPicPr/>
+                  </pic:nvPicPr>
+                  <pic:blipFill>
+                    <a:blip r:embed="rId10"/>
+                    <a:stretch>
+                      <a:fillRect/>
+                    </a:stretch>
+                  </pic:blipFill>
+                  <pic:spPr>
+                    <a:xfrm>
+                      <a:off x="0" y="0"/>
+                      <a:ext cx="5363323" cy="1409897"/>
+                    </a:xfrm>
+                    <a:prstGeom prst="rect">
+                      <a:avLst/>
+                    </a:prstGeom>
+                  </pic:spPr>
+                </pic:pic>
+              </a:graphicData>
+            </a:graphic>
+          </wp:inline>
+        </w:drawing>
+      </w:r>
+    </w:p>
+    <w:p>
+      <w:pPr>
+        <w:pStyle w:val="font-claude-response-body"/>
+        <w:ind w:left="720"/>
+      </w:pPr>
+    </w:p>
+    <w:p>
+      <w:pPr>
+        <w:pStyle w:val="font-claude-response-body"/>
+        <w:ind w:left="720"/>
+      </w:pPr>
+    </w:p>
+    <w:p>
+      <w:pPr>
+        <w:pStyle w:val="font-claude-response-body"/>
+        <w:ind w:left="720"/>
+      </w:pPr>
+    </w:p>
+    <w:p>
+      <w:pPr>
+        <w:pStyle w:val="font-claude-response-body"/>
+        <w:ind w:left="720"/>
+      </w:pPr>
+    </w:p>
+    <w:p>
+      <w:pPr>
+        <w:pStyle w:val="font-claude-response-body"/>
+        <w:ind w:left="720"/>
+      </w:pPr>
+    </w:p>
+    <w:p>
+      <w:pPr>
+        <w:pStyle w:val="font-claude-response-body"/>
+        <w:numPr>
+          <w:ilvl w:val="0"/>
+          <w:numId w:val="1"/>
+        </w:numPr>
+      </w:pPr>
+      <w:r>
+        <w:lastRenderedPageBreak/>
+        <w:t>Proveedores con la cantidad de ingredientes que suministran</w:t>
+      </w:r>
+    </w:p>
+    <w:p>
+      <w:pPr>
+        <w:pStyle w:val="font-claude-response-body"/>
+        <w:ind w:left="720"/>
+      </w:pPr>
+      <w:r>
+        <w:drawing>
+          <wp:inline distT="0" distB="0" distL="0" distR="0" wp14:anchorId="307401AE" wp14:editId="25783F1C">
+            <wp:extent cx="5612130" cy="5405755"/>
+            <wp:effectExtent l="0" t="0" r="7620" b="4445"/>
+            <wp:docPr id="7" name="Imagen 7"/>
+            <wp:cNvGraphicFramePr>
+              <a:graphicFrameLocks xmlns:a="http://schemas.openxmlformats.org/drawingml/2006/main" noChangeAspect="1"/>
+            </wp:cNvGraphicFramePr>
+            <a:graphic xmlns:a="http://schemas.openxmlformats.org/drawingml/2006/main">
+              <a:graphicData uri="http://schemas.openxmlformats.org/drawingml/2006/picture">
+                <pic:pic xmlns:pic="http://schemas.openxmlformats.org/drawingml/2006/picture">
+                  <pic:nvPicPr>
+                    <pic:cNvPr id="1" name=""/>
+                    <pic:cNvPicPr/>
+                  </pic:nvPicPr>
+                  <pic:blipFill>
+                    <a:blip r:embed="rId11"/>
+                    <a:stretch>
+                      <a:fillRect/>
+                    </a:stretch>
+                  </pic:blipFill>
+                  <pic:spPr>
+                    <a:xfrm>
+                      <a:off x="0" y="0"/>
+                      <a:ext cx="5612130" cy="5405755"/>
+                    </a:xfrm>
+                    <a:prstGeom prst="rect">
+                      <a:avLst/>
+                    </a:prstGeom>
+                  </pic:spPr>
+                </pic:pic>
+              </a:graphicData>
+            </a:graphic>
+          </wp:inline>
+        </w:drawing>
+      </w:r>
+    </w:p>
+    <w:p>
+      <w:pPr>
+        <w:pStyle w:val="font-claude-response-body"/>
+        <w:numPr>
+          <w:ilvl w:val="0"/>
+          <w:numId w:val="1"/>
+        </w:numPr>
+      </w:pPr>
+      <w:r>
+        <w:t>Los 10 platillos más vendidos</w:t>
+      </w:r>
+    </w:p>
+    <w:p>
+      <w:pPr>
+        <w:pStyle w:val="font-claude-response-body"/>
+        <w:ind w:left="720"/>
+      </w:pPr>
     </w:p>
     <w:p>
       <w:pPr>
@@ -162,8 +549,106 @@
 </w:document>
 </file>
 
+<file path=word/numbering.xml><?xml version="1.0" encoding="utf-8"?>
+<w:numbering xmlns:wpc="http://schemas.microsoft.com/office/word/2010/wordprocessingCanvas" xmlns:cx="http://schemas.microsoft.com/office/drawing/2014/chartex" xmlns:cx1="http://schemas.microsoft.com/office/drawing/2015/9/8/chartex" xmlns:cx2="http://schemas.microsoft.com/office/drawing/2015/10/21/chartex" xmlns:cx3="http://schemas.microsoft.com/office/drawing/2016/5/9/chartex" xmlns:cx4="http://schemas.microsoft.com/office/drawing/2016/5/10/chartex" xmlns:cx5="http://schemas.microsoft.com/office/drawing/2016/5/11/chartex" xmlns:cx6="http://schemas.microsoft.com/office/drawing/2016/5/12/chartex" xmlns:cx7="http://schemas.microsoft.com/office/drawing/2016/5/13/chartex" xmlns:cx8="http://schemas.microsoft.com/office/drawing/2016/5/14/chartex" xmlns:mc="http://schemas.openxmlformats.org/markup-compatibility/2006" xmlns:aink="http://schemas.microsoft.com/office/drawing/2016/ink" xmlns:am3d="http://schemas.microsoft.com/office/drawing/2017/model3d" xmlns:o="urn:schemas-microsoft-com:office:office" xmlns:oel="http://schemas.microsoft.com/office/2019/extlst" xmlns:r="http://schemas.openxmlformats.org/officeDocument/2006/relationships" xmlns:m="http://schemas.openxmlformats.org/officeDocument/2006/math" xmlns:v="urn:schemas-microsoft-com:vml" xmlns:wp14="http://schemas.microsoft.com/office/word/2010/wordprocessingDrawing" xmlns:wp="http://schemas.openxmlformats.org/drawingml/2006/wordprocessingDrawing" xmlns:w10="urn:schemas-microsoft-com:office:word" xmlns:w="http://schemas.openxmlformats.org/wordprocessingml/2006/main" xmlns:w14="http://schemas.microsoft.com/office/word/2010/wordml" xmlns:w15="http://schemas.microsoft.com/office/word/2012/wordml" xmlns:w16cex="http://schemas.microsoft.com/office/word/2018/wordml/cex" xmlns:w16cid="http://schemas.microsoft.com/office/word/2016/wordml/cid" xmlns:w16="http://schemas.microsoft.com/office/word/2018/wordml" xmlns:w16sdtdh="http://schemas.microsoft.com/office/word/2020/wordml/sdtdatahash" xmlns:w16se="http://schemas.microsoft.com/office/word/2015/wordml/symex" xmlns:wpg="http://schemas.microsoft.com/office/word/2010/wordprocessingGroup" xmlns:wpi="http://schemas.microsoft.com/office/word/2010/wordprocessingInk" xmlns:wne="http://schemas.microsoft.com/office/word/2006/wordml" xmlns:wps="http://schemas.microsoft.com/office/word/2010/wordprocessingShape" mc:Ignorable="w14 w15 w16se w16cid w16 w16cex w16sdtdh wp14">
+  <w:abstractNum w:abstractNumId="0" w15:restartNumberingAfterBreak="0">
+    <w:nsid w:val="754A6620"/>
+    <w:multiLevelType w:val="hybridMultilevel"/>
+    <w:tmpl w:val="41CCA1EA"/>
+    <w:lvl w:ilvl="0" w:tplc="B9F0A2A0">
+      <w:start w:val="1"/>
+      <w:numFmt w:val="decimal"/>
+      <w:lvlText w:val="%1."/>
+      <w:lvlJc w:val="left"/>
+      <w:pPr>
+        <w:ind w:left="720" w:hanging="360"/>
+      </w:pPr>
+      <w:rPr>
+        <w:rFonts w:eastAsiaTheme="majorEastAsia" w:hint="default"/>
+        <w:b/>
+      </w:rPr>
+    </w:lvl>
+    <w:lvl w:ilvl="1" w:tplc="080A0019" w:tentative="1">
+      <w:start w:val="1"/>
+      <w:numFmt w:val="lowerLetter"/>
+      <w:lvlText w:val="%2."/>
+      <w:lvlJc w:val="left"/>
+      <w:pPr>
+        <w:ind w:left="1440" w:hanging="360"/>
+      </w:pPr>
+    </w:lvl>
+    <w:lvl w:ilvl="2" w:tplc="080A001B" w:tentative="1">
+      <w:start w:val="1"/>
+      <w:numFmt w:val="lowerRoman"/>
+      <w:lvlText w:val="%3."/>
+      <w:lvlJc w:val="right"/>
+      <w:pPr>
+        <w:ind w:left="2160" w:hanging="180"/>
+      </w:pPr>
+    </w:lvl>
+    <w:lvl w:ilvl="3" w:tplc="080A000F" w:tentative="1">
+      <w:start w:val="1"/>
+      <w:numFmt w:val="decimal"/>
+      <w:lvlText w:val="%4."/>
+      <w:lvlJc w:val="left"/>
+      <w:pPr>
+        <w:ind w:left="2880" w:hanging="360"/>
+      </w:pPr>
+    </w:lvl>
+    <w:lvl w:ilvl="4" w:tplc="080A0019" w:tentative="1">
+      <w:start w:val="1"/>
+      <w:numFmt w:val="lowerLetter"/>
+      <w:lvlText w:val="%5."/>
+      <w:lvlJc w:val="left"/>
+      <w:pPr>
+        <w:ind w:left="3600" w:hanging="360"/>
+      </w:pPr>
+    </w:lvl>
+    <w:lvl w:ilvl="5" w:tplc="080A001B" w:tentative="1">
+      <w:start w:val="1"/>
+      <w:numFmt w:val="lowerRoman"/>
+      <w:lvlText w:val="%6."/>
+      <w:lvlJc w:val="right"/>
+      <w:pPr>
+        <w:ind w:left="4320" w:hanging="180"/>
+      </w:pPr>
+    </w:lvl>
+    <w:lvl w:ilvl="6" w:tplc="080A000F" w:tentative="1">
+      <w:start w:val="1"/>
+      <w:numFmt w:val="decimal"/>
+      <w:lvlText w:val="%7."/>
+      <w:lvlJc w:val="left"/>
+      <w:pPr>
+        <w:ind w:left="5040" w:hanging="360"/>
+      </w:pPr>
+    </w:lvl>
+    <w:lvl w:ilvl="7" w:tplc="080A0019" w:tentative="1">
+      <w:start w:val="1"/>
+      <w:numFmt w:val="lowerLetter"/>
+      <w:lvlText w:val="%8."/>
+      <w:lvlJc w:val="left"/>
+      <w:pPr>
+        <w:ind w:left="5760" w:hanging="360"/>
+      </w:pPr>
+    </w:lvl>
+    <w:lvl w:ilvl="8" w:tplc="080A001B" w:tentative="1">
+      <w:start w:val="1"/>
+      <w:numFmt w:val="lowerRoman"/>
+      <w:lvlText w:val="%9."/>
+      <w:lvlJc w:val="right"/>
+      <w:pPr>
+        <w:ind w:left="6480" w:hanging="180"/>
+      </w:pPr>
+    </w:lvl>
+  </w:abstractNum>
+  <w:num w:numId="1" w16cid:durableId="1806267195">
+    <w:abstractNumId w:val="0"/>
+  </w:num>
+</w:numbering>
+</file>
+
 <file path=word/styles.xml><?xml version="1.0" encoding="utf-8"?>
-<w:styles xmlns:mc="http://schemas.openxmlformats.org/markup-compatibility/2006" xmlns:r="http://schemas.openxmlformats.org/officeDocument/2006/relationships" xmlns:w="http://schemas.openxmlformats.org/wordprocessingml/2006/main" xmlns:w14="http://schemas.microsoft.com/office/word/2010/wordml" xmlns:w15="http://schemas.microsoft.com/office/word/2012/wordml" xmlns:w16cex="http://schemas.microsoft.com/office/word/2018/wordml/cex" xmlns:w16cid="http://schemas.microsoft.com/office/word/2016/wordml/cid" xmlns:w16="http://schemas.microsoft.com/office/word/2018/wordml" xmlns:w16du="http://schemas.microsoft.com/office/word/2023/wordml/word16du" xmlns:w16sdtdh="http://schemas.microsoft.com/office/word/2020/wordml/sdtdatahash" xmlns:w16se="http://schemas.microsoft.com/office/word/2015/wordml/symex" mc:Ignorable="w14 w15 w16se w16cid w16 w16cex w16sdtdh w16du">
+<w:styles xmlns:mc="http://schemas.openxmlformats.org/markup-compatibility/2006" xmlns:r="http://schemas.openxmlformats.org/officeDocument/2006/relationships" xmlns:w="http://schemas.openxmlformats.org/wordprocessingml/2006/main" xmlns:w14="http://schemas.microsoft.com/office/word/2010/wordml" xmlns:w15="http://schemas.microsoft.com/office/word/2012/wordml" xmlns:w16cex="http://schemas.microsoft.com/office/word/2018/wordml/cex" xmlns:w16cid="http://schemas.microsoft.com/office/word/2016/wordml/cid" xmlns:w16="http://schemas.microsoft.com/office/word/2018/wordml" xmlns:w16sdtdh="http://schemas.microsoft.com/office/word/2020/wordml/sdtdatahash" xmlns:w16se="http://schemas.microsoft.com/office/word/2015/wordml/symex" mc:Ignorable="w14 w15 w16se w16cid w16 w16cex w16sdtdh">
   <w:docDefaults>
     <w:rPrDefault>
       <w:rPr>

</xml_diff>